<commit_message>
modificaciones en el word
</commit_message>
<xml_diff>
--- a/docs/git hub.docx
+++ b/docs/git hub.docx
@@ -18,7 +18,7 @@
           <w:noProof/>
           <w:sz w:val="24"/>
           <w:szCs w:val="24"/>
-          <w:lang w:eastAsia="es-NI"/>
+          <w:lang w:val="es-NI" w:eastAsia="es-NI"/>
         </w:rPr>
         <w:drawing>
           <wp:anchor distT="0" distB="0" distL="114300" distR="114300" simplePos="0" relativeHeight="251659264" behindDoc="0" locked="0" layoutInCell="1" allowOverlap="1" wp14:anchorId="5FB6CCE2" wp14:editId="02DEE6E7">
@@ -127,12 +127,7 @@
         <w:br/>
       </w:r>
       <w:r>
-        <w:t xml:space="preserve">         Aspectos T</w:t>
-      </w:r>
-      <w:bookmarkStart w:id="0" w:name="_GoBack"/>
-      <w:bookmarkEnd w:id="0"/>
-      <w:r>
-        <w:t xml:space="preserve">ecnológicos </w:t>
+        <w:t xml:space="preserve">         Aspectos Tecnológicos </w:t>
       </w:r>
     </w:p>
     <w:p>
@@ -269,8 +264,10 @@
     </w:p>
     <w:p>
       <w:pPr>
-        <w:rPr>
-          <w:rFonts w:ascii="Arial" w:hAnsi="Arial" w:cs="Arial"/>
+        <w:spacing w:before="100" w:beforeAutospacing="1" w:after="100" w:afterAutospacing="1" w:line="240" w:lineRule="auto"/>
+        <w:rPr>
+          <w:rFonts w:ascii="Arial" w:hAnsi="Arial" w:cs="Arial"/>
+          <w:b/>
         </w:rPr>
       </w:pPr>
       <w:r>
@@ -279,42 +276,326 @@
           <w:b/>
         </w:rPr>
         <w:lastRenderedPageBreak/>
+        <w:t>DATOS DEL VIDEOJUEGO</w:t>
+      </w:r>
+    </w:p>
+    <w:p>
+      <w:pPr>
+        <w:spacing w:before="100" w:beforeAutospacing="1" w:after="100" w:afterAutospacing="1" w:line="240" w:lineRule="auto"/>
+        <w:rPr>
+          <w:rFonts w:ascii="Arial" w:hAnsi="Arial" w:cs="Arial"/>
+        </w:rPr>
+      </w:pPr>
+      <w:r>
+        <w:rPr>
+          <w:rFonts w:ascii="Arial" w:hAnsi="Arial" w:cs="Arial"/>
+          <w:b/>
+        </w:rPr>
+        <w:t>Nombre del videojuego:</w:t>
+      </w:r>
+      <w:r>
+        <w:rPr>
+          <w:rFonts w:ascii="Arial" w:hAnsi="Arial" w:cs="Arial"/>
+        </w:rPr>
+        <w:t xml:space="preserve"> </w:t>
+      </w:r>
+      <w:proofErr w:type="spellStart"/>
+      <w:r>
+        <w:rPr>
+          <w:rFonts w:ascii="Arial" w:hAnsi="Arial" w:cs="Arial"/>
+        </w:rPr>
+        <w:t>Decimalandia</w:t>
+      </w:r>
+      <w:proofErr w:type="spellEnd"/>
+    </w:p>
+    <w:p>
+      <w:pPr>
+        <w:spacing w:before="100" w:beforeAutospacing="1" w:after="100" w:afterAutospacing="1" w:line="240" w:lineRule="auto"/>
+        <w:rPr>
+          <w:rFonts w:ascii="Arial" w:hAnsi="Arial" w:cs="Arial"/>
+        </w:rPr>
+      </w:pPr>
+      <w:r>
+        <w:rPr>
+          <w:rFonts w:ascii="Arial" w:hAnsi="Arial" w:cs="Arial"/>
+          <w:b/>
+        </w:rPr>
+        <w:t>Tipo de juego</w:t>
+      </w:r>
+      <w:r>
+        <w:rPr>
+          <w:rFonts w:ascii="Arial" w:hAnsi="Arial" w:cs="Arial"/>
+        </w:rPr>
+        <w:t>: Educativo</w:t>
+      </w:r>
+    </w:p>
+    <w:p>
+      <w:pPr>
+        <w:spacing w:before="100" w:beforeAutospacing="1" w:after="100" w:afterAutospacing="1" w:line="240" w:lineRule="auto"/>
+        <w:rPr>
+          <w:rFonts w:ascii="Arial" w:hAnsi="Arial" w:cs="Arial"/>
+        </w:rPr>
+      </w:pPr>
+      <w:r>
+        <w:rPr>
+          <w:rFonts w:ascii="Arial" w:hAnsi="Arial" w:cs="Arial"/>
+          <w:b/>
+        </w:rPr>
+        <w:t>Tema:</w:t>
+      </w:r>
+      <w:r>
+        <w:rPr>
+          <w:rFonts w:ascii="Arial" w:hAnsi="Arial" w:cs="Arial"/>
+        </w:rPr>
+        <w:t xml:space="preserve"> Números decimales</w:t>
+      </w:r>
+    </w:p>
+    <w:p>
+      <w:pPr>
+        <w:spacing w:before="100" w:beforeAutospacing="1" w:after="100" w:afterAutospacing="1" w:line="240" w:lineRule="auto"/>
+        <w:rPr>
+          <w:rFonts w:ascii="Arial" w:hAnsi="Arial" w:cs="Arial"/>
+        </w:rPr>
+      </w:pPr>
+      <w:r>
+        <w:rPr>
+          <w:rFonts w:ascii="Arial" w:hAnsi="Arial" w:cs="Arial"/>
+          <w:b/>
+        </w:rPr>
+        <w:t>Plataforma:</w:t>
+      </w:r>
+      <w:r>
+        <w:rPr>
+          <w:rFonts w:ascii="Arial" w:hAnsi="Arial" w:cs="Arial"/>
+        </w:rPr>
+        <w:t xml:space="preserve"> </w:t>
+      </w:r>
+      <w:proofErr w:type="spellStart"/>
+      <w:r>
+        <w:rPr>
+          <w:rFonts w:ascii="Arial" w:hAnsi="Arial" w:cs="Arial"/>
+        </w:rPr>
+        <w:t>Unity</w:t>
+      </w:r>
+      <w:proofErr w:type="spellEnd"/>
+      <w:r>
+        <w:rPr>
+          <w:rFonts w:ascii="Arial" w:hAnsi="Arial" w:cs="Arial"/>
+        </w:rPr>
+        <w:t xml:space="preserve"> (PC)</w:t>
+      </w:r>
+    </w:p>
+    <w:p>
+      <w:pPr>
+        <w:spacing w:before="100" w:beforeAutospacing="1" w:after="100" w:afterAutospacing="1" w:line="240" w:lineRule="auto"/>
+        <w:rPr>
+          <w:rFonts w:ascii="Arial" w:hAnsi="Arial" w:cs="Arial"/>
+          <w:b/>
+        </w:rPr>
+      </w:pPr>
+      <w:r>
+        <w:rPr>
+          <w:rFonts w:ascii="Arial" w:hAnsi="Arial" w:cs="Arial"/>
+          <w:b/>
+        </w:rPr>
+        <w:t>Descripción:</w:t>
+      </w:r>
+    </w:p>
+    <w:p>
+      <w:pPr>
+        <w:spacing w:before="100" w:beforeAutospacing="1" w:after="100" w:afterAutospacing="1" w:line="240" w:lineRule="auto"/>
+        <w:rPr>
+          <w:rFonts w:ascii="Arial" w:hAnsi="Arial" w:cs="Arial"/>
+        </w:rPr>
+      </w:pPr>
+      <w:proofErr w:type="spellStart"/>
+      <w:r>
+        <w:rPr>
+          <w:rFonts w:ascii="Arial" w:hAnsi="Arial" w:cs="Arial"/>
+        </w:rPr>
+        <w:t>Decimalandia</w:t>
+      </w:r>
+      <w:proofErr w:type="spellEnd"/>
+      <w:r>
+        <w:rPr>
+          <w:rFonts w:ascii="Arial" w:hAnsi="Arial" w:cs="Arial"/>
+        </w:rPr>
+        <w:t xml:space="preserve"> es un videojuego educativo dirigido a niños de primaria, donde el jugador aprende a trabajar con números decimales a través de actividades interactivas como selección única, múltiple y ejercicios de arrastrar.</w:t>
+      </w:r>
+    </w:p>
+    <w:p>
+      <w:pPr>
+        <w:spacing w:before="100" w:beforeAutospacing="1" w:after="100" w:afterAutospacing="1" w:line="240" w:lineRule="auto"/>
+        <w:rPr>
+          <w:rFonts w:ascii="Arial" w:hAnsi="Arial" w:cs="Arial"/>
+        </w:rPr>
+      </w:pPr>
+    </w:p>
+    <w:p>
+      <w:pPr>
+        <w:spacing w:before="100" w:beforeAutospacing="1" w:after="100" w:afterAutospacing="1" w:line="240" w:lineRule="auto"/>
+        <w:rPr>
+          <w:rFonts w:ascii="Arial" w:hAnsi="Arial" w:cs="Arial"/>
+          <w:b/>
+        </w:rPr>
+      </w:pPr>
+      <w:r>
+        <w:rPr>
+          <w:rFonts w:ascii="Arial" w:hAnsi="Arial" w:cs="Arial"/>
+          <w:b/>
+        </w:rPr>
+        <w:t>Objetivo del juego:</w:t>
+      </w:r>
+    </w:p>
+    <w:p>
+      <w:pPr>
+        <w:spacing w:before="100" w:beforeAutospacing="1" w:after="100" w:afterAutospacing="1" w:line="240" w:lineRule="auto"/>
+        <w:rPr>
+          <w:rFonts w:ascii="Arial" w:hAnsi="Arial" w:cs="Arial"/>
+        </w:rPr>
+      </w:pPr>
+      <w:r>
+        <w:rPr>
+          <w:rFonts w:ascii="Arial" w:hAnsi="Arial" w:cs="Arial"/>
+        </w:rPr>
+        <w:t>Ayudar a los estudiantes a comprender los números decimale</w:t>
+      </w:r>
+      <w:r>
+        <w:rPr>
+          <w:rFonts w:ascii="Arial" w:hAnsi="Arial" w:cs="Arial"/>
+        </w:rPr>
+        <w:t>s de forma dinámica y divertida.</w:t>
+      </w:r>
+    </w:p>
+    <w:p>
+      <w:pPr>
+        <w:spacing w:before="100" w:beforeAutospacing="1" w:after="100" w:afterAutospacing="1" w:line="240" w:lineRule="auto"/>
+        <w:rPr>
+          <w:rFonts w:ascii="Arial" w:eastAsia="Times New Roman" w:hAnsi="Arial" w:cs="Arial"/>
+          <w:b/>
+          <w:lang w:val="es-NI" w:eastAsia="es-NI"/>
+        </w:rPr>
+      </w:pPr>
+      <w:r>
+        <w:rPr>
+          <w:rFonts w:ascii="Arial" w:eastAsia="Times New Roman" w:hAnsi="Arial" w:cs="Arial"/>
+          <w:b/>
+          <w:lang w:val="es-NI" w:eastAsia="es-NI"/>
+        </w:rPr>
+        <w:t>DATOS DEL REPOSITORIO</w:t>
+      </w:r>
+    </w:p>
+    <w:p>
+      <w:pPr>
+        <w:spacing w:before="100" w:beforeAutospacing="1" w:after="100" w:afterAutospacing="1" w:line="240" w:lineRule="auto"/>
+        <w:rPr>
+          <w:rFonts w:ascii="Arial" w:eastAsia="Times New Roman" w:hAnsi="Arial" w:cs="Arial"/>
+          <w:lang w:val="es-NI" w:eastAsia="es-NI"/>
+        </w:rPr>
+      </w:pPr>
+      <w:r>
+        <w:rPr>
+          <w:rFonts w:ascii="Arial" w:eastAsia="Times New Roman" w:hAnsi="Arial" w:cs="Arial"/>
+          <w:b/>
+          <w:lang w:val="es-NI" w:eastAsia="es-NI"/>
+        </w:rPr>
         <w:t>Nombre del repositorio:</w:t>
       </w:r>
       <w:r>
         <w:rPr>
-          <w:rFonts w:ascii="Arial" w:hAnsi="Arial" w:cs="Arial"/>
-        </w:rPr>
-        <w:t xml:space="preserve"> </w:t>
+          <w:rFonts w:ascii="Arial" w:eastAsia="Times New Roman" w:hAnsi="Arial" w:cs="Arial"/>
+          <w:lang w:val="es-NI" w:eastAsia="es-NI"/>
+        </w:rPr>
+        <w:t xml:space="preserve"> decimalandia-integrador</w:t>
+      </w:r>
+      <w:r>
+        <w:rPr>
+          <w:rFonts w:ascii="Arial" w:eastAsia="Times New Roman" w:hAnsi="Arial" w:cs="Arial"/>
+          <w:lang w:val="es-NI" w:eastAsia="es-NI"/>
+        </w:rPr>
+        <w:t>1</w:t>
+      </w:r>
+    </w:p>
+    <w:p>
+      <w:pPr>
+        <w:spacing w:before="100" w:beforeAutospacing="1" w:after="100" w:afterAutospacing="1" w:line="240" w:lineRule="auto"/>
+        <w:rPr>
+          <w:rFonts w:ascii="Arial" w:eastAsia="Times New Roman" w:hAnsi="Arial" w:cs="Arial"/>
+          <w:lang w:val="es-NI" w:eastAsia="es-NI"/>
+        </w:rPr>
+      </w:pPr>
+      <w:r>
+        <w:rPr>
+          <w:rFonts w:ascii="Arial" w:eastAsia="Times New Roman" w:hAnsi="Arial" w:cs="Arial"/>
+          <w:b/>
+          <w:lang w:val="es-NI" w:eastAsia="es-NI"/>
+        </w:rPr>
+        <w:t>Plataforma:</w:t>
+      </w:r>
+      <w:r>
+        <w:rPr>
+          <w:rFonts w:ascii="Arial" w:eastAsia="Times New Roman" w:hAnsi="Arial" w:cs="Arial"/>
+          <w:lang w:val="es-NI" w:eastAsia="es-NI"/>
+        </w:rPr>
+        <w:t xml:space="preserve"> GitHub</w:t>
+      </w:r>
+    </w:p>
+    <w:p>
+      <w:pPr>
+        <w:spacing w:before="100" w:beforeAutospacing="1" w:after="100" w:afterAutospacing="1" w:line="240" w:lineRule="auto"/>
+        <w:rPr>
+          <w:rFonts w:ascii="Arial" w:eastAsia="Times New Roman" w:hAnsi="Arial" w:cs="Arial"/>
+          <w:lang w:val="es-NI" w:eastAsia="es-NI"/>
+        </w:rPr>
+      </w:pPr>
+      <w:r>
+        <w:rPr>
+          <w:rFonts w:ascii="Arial" w:eastAsia="Times New Roman" w:hAnsi="Arial" w:cs="Arial"/>
+          <w:b/>
+          <w:lang w:val="es-NI" w:eastAsia="es-NI"/>
+        </w:rPr>
+        <w:t>Enlace del repositorio:</w:t>
+      </w:r>
+      <w:r>
+        <w:rPr>
+          <w:rFonts w:ascii="Arial" w:eastAsia="Times New Roman" w:hAnsi="Arial" w:cs="Arial"/>
+          <w:lang w:val="es-NI" w:eastAsia="es-NI"/>
+        </w:rPr>
+        <w:t xml:space="preserve"> (aquí </w:t>
       </w:r>
       <w:proofErr w:type="spellStart"/>
       <w:r>
         <w:rPr>
-          <w:rFonts w:ascii="Arial" w:hAnsi="Arial" w:cs="Arial"/>
-        </w:rPr>
-        <w:t>decimalandia</w:t>
+          <w:rFonts w:ascii="Arial" w:eastAsia="Times New Roman" w:hAnsi="Arial" w:cs="Arial"/>
+          <w:lang w:val="es-NI" w:eastAsia="es-NI"/>
+        </w:rPr>
+        <w:t>pegás</w:t>
       </w:r>
       <w:proofErr w:type="spellEnd"/>
       <w:r>
         <w:rPr>
-          <w:rFonts w:ascii="Arial" w:hAnsi="Arial" w:cs="Arial"/>
-        </w:rPr>
-        <w:t>-integrador</w:t>
-      </w:r>
-    </w:p>
-    <w:p>
-      <w:pPr>
-        <w:rPr>
-          <w:rFonts w:ascii="Arial" w:hAnsi="Arial" w:cs="Arial"/>
-          <w:b/>
-        </w:rPr>
-      </w:pPr>
-      <w:r>
-        <w:rPr>
-          <w:rFonts w:ascii="Arial" w:hAnsi="Arial" w:cs="Arial"/>
-          <w:b/>
-        </w:rPr>
-        <w:t xml:space="preserve">Nombre de usuarios: </w:t>
+          <w:rFonts w:ascii="Arial" w:eastAsia="Times New Roman" w:hAnsi="Arial" w:cs="Arial"/>
+          <w:lang w:val="es-NI" w:eastAsia="es-NI"/>
+        </w:rPr>
+        <w:t xml:space="preserve"> el link)</w:t>
+      </w:r>
+    </w:p>
+    <w:p>
+      <w:pPr>
+        <w:spacing w:before="100" w:beforeAutospacing="1" w:after="100" w:afterAutospacing="1" w:line="240" w:lineRule="auto"/>
+        <w:rPr>
+          <w:rFonts w:ascii="Arial" w:eastAsia="Times New Roman" w:hAnsi="Arial" w:cs="Arial"/>
+          <w:b/>
+          <w:lang w:val="es-NI" w:eastAsia="es-NI"/>
+        </w:rPr>
+      </w:pPr>
+      <w:r>
+        <w:rPr>
+          <w:rFonts w:ascii="Arial" w:eastAsia="Times New Roman" w:hAnsi="Arial" w:cs="Arial"/>
+          <w:b/>
+          <w:lang w:val="es-NI" w:eastAsia="es-NI"/>
+        </w:rPr>
+        <w:t>Integrantes del equipo:</w:t>
       </w:r>
     </w:p>
     <w:p>
@@ -322,15 +603,18 @@
         <w:pStyle w:val="Prrafodelista"/>
         <w:numPr>
           <w:ilvl w:val="0"/>
-          <w:numId w:val="1"/>
+          <w:numId w:val="4"/>
         </w:numPr>
-        <w:rPr>
-          <w:rFonts w:ascii="Arial" w:hAnsi="Arial" w:cs="Arial"/>
-        </w:rPr>
-      </w:pPr>
-      <w:r>
-        <w:rPr>
-          <w:rFonts w:ascii="Arial" w:hAnsi="Arial" w:cs="Arial"/>
+        <w:spacing w:before="100" w:beforeAutospacing="1" w:after="100" w:afterAutospacing="1" w:line="240" w:lineRule="auto"/>
+        <w:rPr>
+          <w:rFonts w:ascii="Arial" w:eastAsia="Times New Roman" w:hAnsi="Arial" w:cs="Arial"/>
+          <w:lang w:val="es-NI" w:eastAsia="es-NI"/>
+        </w:rPr>
+      </w:pPr>
+      <w:r>
+        <w:rPr>
+          <w:rFonts w:ascii="Arial" w:eastAsia="Times New Roman" w:hAnsi="Arial" w:cs="Arial"/>
+          <w:lang w:val="es-NI" w:eastAsia="es-NI"/>
         </w:rPr>
         <w:t>alvaradoamaral106</w:t>
       </w:r>
@@ -340,15 +624,18 @@
         <w:pStyle w:val="Prrafodelista"/>
         <w:numPr>
           <w:ilvl w:val="0"/>
-          <w:numId w:val="1"/>
+          <w:numId w:val="4"/>
         </w:numPr>
-        <w:rPr>
-          <w:rFonts w:ascii="Arial" w:hAnsi="Arial" w:cs="Arial"/>
-        </w:rPr>
-      </w:pPr>
-      <w:r>
-        <w:rPr>
-          <w:rFonts w:ascii="Arial" w:hAnsi="Arial" w:cs="Arial"/>
+        <w:spacing w:before="100" w:beforeAutospacing="1" w:after="100" w:afterAutospacing="1" w:line="240" w:lineRule="auto"/>
+        <w:rPr>
+          <w:rFonts w:ascii="Arial" w:eastAsia="Times New Roman" w:hAnsi="Arial" w:cs="Arial"/>
+          <w:lang w:val="es-NI" w:eastAsia="es-NI"/>
+        </w:rPr>
+      </w:pPr>
+      <w:r>
+        <w:rPr>
+          <w:rFonts w:ascii="Arial" w:eastAsia="Times New Roman" w:hAnsi="Arial" w:cs="Arial"/>
+          <w:lang w:val="es-NI" w:eastAsia="es-NI"/>
         </w:rPr>
         <w:t>Benjicks3000</w:t>
       </w:r>
@@ -358,102 +645,7 @@
         <w:pStyle w:val="Prrafodelista"/>
         <w:numPr>
           <w:ilvl w:val="0"/>
-          <w:numId w:val="1"/>
-        </w:numPr>
-        <w:rPr>
-          <w:rFonts w:ascii="Arial" w:hAnsi="Arial" w:cs="Arial"/>
-        </w:rPr>
-      </w:pPr>
-      <w:proofErr w:type="spellStart"/>
-      <w:r>
-        <w:rPr>
-          <w:rFonts w:ascii="Arial" w:hAnsi="Arial" w:cs="Arial"/>
-        </w:rPr>
-        <w:t>josenica</w:t>
-      </w:r>
-      <w:proofErr w:type="spellEnd"/>
-    </w:p>
-    <w:p>
-      <w:pPr>
-        <w:spacing w:before="100" w:beforeAutospacing="1" w:after="100" w:afterAutospacing="1" w:line="240" w:lineRule="auto"/>
-        <w:rPr>
-          <w:rFonts w:ascii="Arial" w:eastAsia="Times New Roman" w:hAnsi="Arial" w:cs="Arial"/>
-          <w:lang w:val="es-NI" w:eastAsia="es-NI"/>
-        </w:rPr>
-      </w:pPr>
-      <w:r>
-        <w:rPr>
-          <w:rFonts w:ascii="Arial" w:eastAsia="Times New Roman" w:hAnsi="Arial" w:cs="Arial"/>
-          <w:b/>
-          <w:bCs/>
-          <w:lang w:val="es-NI" w:eastAsia="es-NI"/>
-        </w:rPr>
-        <w:t>Procedimiento:</w:t>
-      </w:r>
-      <w:r>
-        <w:rPr>
-          <w:rFonts w:ascii="Arial" w:eastAsia="Times New Roman" w:hAnsi="Arial" w:cs="Arial"/>
-          <w:lang w:val="es-NI" w:eastAsia="es-NI"/>
-        </w:rPr>
-        <w:br/>
-        <w:t xml:space="preserve">Se utilizaron funciones básicas de </w:t>
-      </w:r>
-      <w:proofErr w:type="spellStart"/>
-      <w:r>
-        <w:rPr>
-          <w:rFonts w:ascii="Arial" w:eastAsia="Times New Roman" w:hAnsi="Arial" w:cs="Arial"/>
-          <w:lang w:val="es-NI" w:eastAsia="es-NI"/>
-        </w:rPr>
-        <w:t>Git</w:t>
-      </w:r>
-      <w:proofErr w:type="spellEnd"/>
-      <w:r>
-        <w:rPr>
-          <w:rFonts w:ascii="Arial" w:eastAsia="Times New Roman" w:hAnsi="Arial" w:cs="Arial"/>
-          <w:lang w:val="es-NI" w:eastAsia="es-NI"/>
-        </w:rPr>
-        <w:t xml:space="preserve"> para clonar un repositorio desde GitHub, así como para trabajar sobre la rama principal (</w:t>
-      </w:r>
-      <w:proofErr w:type="spellStart"/>
-      <w:r>
-        <w:rPr>
-          <w:rFonts w:ascii="Arial" w:eastAsia="Times New Roman" w:hAnsi="Arial" w:cs="Arial"/>
-          <w:i/>
-          <w:iCs/>
-          <w:lang w:val="es-NI" w:eastAsia="es-NI"/>
-        </w:rPr>
-        <w:t>main</w:t>
-      </w:r>
-      <w:proofErr w:type="spellEnd"/>
-      <w:r>
-        <w:rPr>
-          <w:rFonts w:ascii="Arial" w:eastAsia="Times New Roman" w:hAnsi="Arial" w:cs="Arial"/>
-          <w:lang w:val="es-NI" w:eastAsia="es-NI"/>
-        </w:rPr>
-        <w:t>).</w:t>
-      </w:r>
-    </w:p>
-    <w:p>
-      <w:pPr>
-        <w:spacing w:before="100" w:beforeAutospacing="1" w:after="100" w:afterAutospacing="1" w:line="240" w:lineRule="auto"/>
-        <w:rPr>
-          <w:rFonts w:ascii="Arial" w:eastAsia="Times New Roman" w:hAnsi="Arial" w:cs="Arial"/>
-          <w:lang w:val="es-NI" w:eastAsia="es-NI"/>
-        </w:rPr>
-      </w:pPr>
-      <w:r>
-        <w:rPr>
-          <w:rFonts w:ascii="Arial" w:eastAsia="Times New Roman" w:hAnsi="Arial" w:cs="Arial"/>
-          <w:lang w:val="es-NI" w:eastAsia="es-NI"/>
-        </w:rPr>
-        <w:t>Se crearon distintas carpetas para organizar el proyecto, entre ellas:</w:t>
-      </w:r>
-    </w:p>
-    <w:p>
-      <w:pPr>
-        <w:numPr>
-          <w:ilvl w:val="0"/>
-          <w:numId w:val="2"/>
+          <w:numId w:val="4"/>
         </w:numPr>
         <w:spacing w:before="100" w:beforeAutospacing="1" w:after="100" w:afterAutospacing="1" w:line="240" w:lineRule="auto"/>
         <w:rPr>
@@ -465,8 +657,49 @@
       <w:r>
         <w:rPr>
           <w:rFonts w:ascii="Arial" w:eastAsia="Times New Roman" w:hAnsi="Arial" w:cs="Arial"/>
-          <w:b/>
-          <w:bCs/>
+          <w:lang w:val="es-NI" w:eastAsia="es-NI"/>
+        </w:rPr>
+        <w:t>josenica</w:t>
+      </w:r>
+      <w:proofErr w:type="spellEnd"/>
+    </w:p>
+    <w:p>
+      <w:pPr>
+        <w:spacing w:before="100" w:beforeAutospacing="1" w:after="100" w:afterAutospacing="1" w:line="240" w:lineRule="auto"/>
+        <w:rPr>
+          <w:rFonts w:ascii="Arial" w:eastAsia="Times New Roman" w:hAnsi="Arial" w:cs="Arial"/>
+          <w:b/>
+          <w:lang w:val="es-NI" w:eastAsia="es-NI"/>
+        </w:rPr>
+      </w:pPr>
+      <w:r>
+        <w:rPr>
+          <w:rFonts w:ascii="Arial" w:eastAsia="Times New Roman" w:hAnsi="Arial" w:cs="Arial"/>
+          <w:b/>
+          <w:lang w:val="es-NI" w:eastAsia="es-NI"/>
+        </w:rPr>
+        <w:t>Descripción del repositorio:</w:t>
+      </w:r>
+    </w:p>
+    <w:p>
+      <w:pPr>
+        <w:spacing w:before="100" w:beforeAutospacing="1" w:after="100" w:afterAutospacing="1" w:line="240" w:lineRule="auto"/>
+        <w:rPr>
+          <w:rFonts w:ascii="Arial" w:eastAsia="Times New Roman" w:hAnsi="Arial" w:cs="Arial"/>
+          <w:lang w:val="es-NI" w:eastAsia="es-NI"/>
+        </w:rPr>
+      </w:pPr>
+      <w:r>
+        <w:rPr>
+          <w:rFonts w:ascii="Arial" w:eastAsia="Times New Roman" w:hAnsi="Arial" w:cs="Arial"/>
+          <w:lang w:val="es-NI" w:eastAsia="es-NI"/>
+        </w:rPr>
+        <w:t xml:space="preserve">Este repositorio contiene parte de los </w:t>
+      </w:r>
+      <w:proofErr w:type="spellStart"/>
+      <w:r>
+        <w:rPr>
+          <w:rFonts w:ascii="Arial" w:eastAsia="Times New Roman" w:hAnsi="Arial" w:cs="Arial"/>
           <w:lang w:val="es-NI" w:eastAsia="es-NI"/>
         </w:rPr>
         <w:t>assets</w:t>
@@ -475,322 +708,12 @@
       <w:r>
         <w:rPr>
           <w:rFonts w:ascii="Arial" w:eastAsia="Times New Roman" w:hAnsi="Arial" w:cs="Arial"/>
-          <w:b/>
-          <w:bCs/>
-          <w:lang w:val="es-NI" w:eastAsia="es-NI"/>
-        </w:rPr>
-        <w:t>:</w:t>
-      </w:r>
-      <w:r>
-        <w:rPr>
-          <w:rFonts w:ascii="Arial" w:eastAsia="Times New Roman" w:hAnsi="Arial" w:cs="Arial"/>
-          <w:lang w:val="es-NI" w:eastAsia="es-NI"/>
-        </w:rPr>
-        <w:t xml:space="preserve"> destinada a almacenar recursos como imágenes, audios y otros elementos visuales. </w:t>
-      </w:r>
-    </w:p>
-    <w:p>
-      <w:pPr>
-        <w:numPr>
-          <w:ilvl w:val="0"/>
-          <w:numId w:val="2"/>
-        </w:numPr>
-        <w:spacing w:before="100" w:beforeAutospacing="1" w:after="100" w:afterAutospacing="1" w:line="240" w:lineRule="auto"/>
-        <w:rPr>
-          <w:rFonts w:ascii="Arial" w:eastAsia="Times New Roman" w:hAnsi="Arial" w:cs="Arial"/>
-          <w:lang w:val="es-NI" w:eastAsia="es-NI"/>
-        </w:rPr>
-      </w:pPr>
-      <w:r>
-        <w:rPr>
-          <w:rFonts w:ascii="Arial" w:eastAsia="Times New Roman" w:hAnsi="Arial" w:cs="Arial"/>
-          <w:b/>
-          <w:bCs/>
-          <w:lang w:val="es-NI" w:eastAsia="es-NI"/>
-        </w:rPr>
-        <w:t>scripts:</w:t>
-      </w:r>
-      <w:r>
-        <w:rPr>
-          <w:rFonts w:ascii="Arial" w:eastAsia="Times New Roman" w:hAnsi="Arial" w:cs="Arial"/>
-          <w:lang w:val="es-NI" w:eastAsia="es-NI"/>
-        </w:rPr>
-        <w:t xml:space="preserve"> donde se guardan los scripts del juego, incluyendo movimientos como </w:t>
-      </w:r>
-      <w:r>
-        <w:rPr>
-          <w:rFonts w:ascii="Arial" w:eastAsia="Times New Roman" w:hAnsi="Arial" w:cs="Arial"/>
-          <w:i/>
-          <w:iCs/>
-          <w:lang w:val="es-NI" w:eastAsia="es-NI"/>
-        </w:rPr>
-        <w:t>idle</w:t>
-      </w:r>
-      <w:r>
-        <w:rPr>
-          <w:rFonts w:ascii="Arial" w:eastAsia="Times New Roman" w:hAnsi="Arial" w:cs="Arial"/>
-          <w:lang w:val="es-NI" w:eastAsia="es-NI"/>
-        </w:rPr>
-        <w:t xml:space="preserve">, </w:t>
-      </w:r>
-      <w:proofErr w:type="spellStart"/>
-      <w:r>
-        <w:rPr>
-          <w:rFonts w:ascii="Arial" w:eastAsia="Times New Roman" w:hAnsi="Arial" w:cs="Arial"/>
-          <w:i/>
-          <w:iCs/>
-          <w:lang w:val="es-NI" w:eastAsia="es-NI"/>
-        </w:rPr>
-        <w:t>walk</w:t>
-      </w:r>
-      <w:proofErr w:type="spellEnd"/>
-      <w:r>
-        <w:rPr>
-          <w:rFonts w:ascii="Arial" w:eastAsia="Times New Roman" w:hAnsi="Arial" w:cs="Arial"/>
-          <w:lang w:val="es-NI" w:eastAsia="es-NI"/>
-        </w:rPr>
-        <w:t xml:space="preserve"> y </w:t>
-      </w:r>
-      <w:r>
-        <w:rPr>
-          <w:rFonts w:ascii="Arial" w:eastAsia="Times New Roman" w:hAnsi="Arial" w:cs="Arial"/>
-          <w:i/>
-          <w:iCs/>
-          <w:lang w:val="es-NI" w:eastAsia="es-NI"/>
-        </w:rPr>
-        <w:t>run</w:t>
-      </w:r>
-      <w:r>
-        <w:rPr>
-          <w:rFonts w:ascii="Arial" w:eastAsia="Times New Roman" w:hAnsi="Arial" w:cs="Arial"/>
-          <w:lang w:val="es-NI" w:eastAsia="es-NI"/>
-        </w:rPr>
-        <w:t xml:space="preserve">. </w:t>
-      </w:r>
-    </w:p>
-    <w:p>
-      <w:pPr>
-        <w:numPr>
-          <w:ilvl w:val="0"/>
-          <w:numId w:val="2"/>
-        </w:numPr>
-        <w:spacing w:before="100" w:beforeAutospacing="1" w:after="100" w:afterAutospacing="1" w:line="240" w:lineRule="auto"/>
-        <w:rPr>
-          <w:rFonts w:ascii="Arial" w:eastAsia="Times New Roman" w:hAnsi="Arial" w:cs="Arial"/>
-          <w:lang w:val="es-NI" w:eastAsia="es-NI"/>
-        </w:rPr>
-      </w:pPr>
-      <w:r>
-        <w:rPr>
-          <w:rFonts w:ascii="Arial" w:eastAsia="Times New Roman" w:hAnsi="Arial" w:cs="Arial"/>
-          <w:b/>
-          <w:bCs/>
-          <w:lang w:val="es-NI" w:eastAsia="es-NI"/>
-        </w:rPr>
-        <w:t>documentos:</w:t>
-      </w:r>
-      <w:r>
-        <w:rPr>
-          <w:rFonts w:ascii="Arial" w:eastAsia="Times New Roman" w:hAnsi="Arial" w:cs="Arial"/>
-          <w:lang w:val="es-NI" w:eastAsia="es-NI"/>
-        </w:rPr>
-        <w:t xml:space="preserve"> utilizada para almacenar archivos requeridos en el desarrollo del proyecto. </w:t>
-      </w:r>
-    </w:p>
-    <w:p>
-      <w:pPr>
-        <w:spacing w:before="100" w:beforeAutospacing="1" w:after="100" w:afterAutospacing="1" w:line="240" w:lineRule="auto"/>
-        <w:rPr>
-          <w:rFonts w:ascii="Arial" w:eastAsia="Times New Roman" w:hAnsi="Arial" w:cs="Arial"/>
-          <w:lang w:val="es-NI" w:eastAsia="es-NI"/>
-        </w:rPr>
-      </w:pPr>
-      <w:r>
-        <w:rPr>
-          <w:rFonts w:ascii="Arial" w:eastAsia="Times New Roman" w:hAnsi="Arial" w:cs="Arial"/>
-          <w:lang w:val="es-NI" w:eastAsia="es-NI"/>
-        </w:rPr>
-        <w:t>Durante el trabajo colaborativo, los integrantes del equipo crearon ramas independientes para desarrollar distintas funcionalidades. Para ello, se emplearon comandos como:</w:t>
-      </w:r>
-    </w:p>
-    <w:p>
-      <w:pPr>
-        <w:numPr>
-          <w:ilvl w:val="0"/>
-          <w:numId w:val="3"/>
-        </w:numPr>
-        <w:spacing w:before="100" w:beforeAutospacing="1" w:after="100" w:afterAutospacing="1" w:line="240" w:lineRule="auto"/>
-        <w:rPr>
-          <w:rFonts w:ascii="Arial" w:eastAsia="Times New Roman" w:hAnsi="Arial" w:cs="Arial"/>
-          <w:lang w:val="es-NI" w:eastAsia="es-NI"/>
-        </w:rPr>
-      </w:pPr>
-      <w:proofErr w:type="spellStart"/>
-      <w:r>
-        <w:rPr>
-          <w:rFonts w:ascii="Arial" w:eastAsia="Times New Roman" w:hAnsi="Arial" w:cs="Arial"/>
-          <w:lang w:val="es-NI" w:eastAsia="es-NI"/>
-        </w:rPr>
-        <w:t>git</w:t>
-      </w:r>
-      <w:proofErr w:type="spellEnd"/>
-      <w:r>
-        <w:rPr>
-          <w:rFonts w:ascii="Arial" w:eastAsia="Times New Roman" w:hAnsi="Arial" w:cs="Arial"/>
-          <w:lang w:val="es-NI" w:eastAsia="es-NI"/>
-        </w:rPr>
-        <w:t xml:space="preserve"> </w:t>
-      </w:r>
-      <w:proofErr w:type="spellStart"/>
-      <w:r>
-        <w:rPr>
-          <w:rFonts w:ascii="Arial" w:eastAsia="Times New Roman" w:hAnsi="Arial" w:cs="Arial"/>
-          <w:lang w:val="es-NI" w:eastAsia="es-NI"/>
-        </w:rPr>
-        <w:t>checkout</w:t>
-      </w:r>
-      <w:proofErr w:type="spellEnd"/>
-      <w:r>
-        <w:rPr>
-          <w:rFonts w:ascii="Arial" w:eastAsia="Times New Roman" w:hAnsi="Arial" w:cs="Arial"/>
-          <w:lang w:val="es-NI" w:eastAsia="es-NI"/>
-        </w:rPr>
-        <w:t xml:space="preserve"> -b nueva-rama </w:t>
-      </w:r>
-    </w:p>
-    <w:p>
-      <w:pPr>
-        <w:numPr>
-          <w:ilvl w:val="0"/>
-          <w:numId w:val="3"/>
-        </w:numPr>
-        <w:spacing w:before="100" w:beforeAutospacing="1" w:after="100" w:afterAutospacing="1" w:line="240" w:lineRule="auto"/>
-        <w:rPr>
-          <w:rFonts w:ascii="Arial" w:eastAsia="Times New Roman" w:hAnsi="Arial" w:cs="Arial"/>
-          <w:lang w:val="es-NI" w:eastAsia="es-NI"/>
-        </w:rPr>
-      </w:pPr>
-      <w:proofErr w:type="spellStart"/>
-      <w:r>
-        <w:rPr>
-          <w:rFonts w:ascii="Arial" w:eastAsia="Times New Roman" w:hAnsi="Arial" w:cs="Arial"/>
-          <w:lang w:val="es-NI" w:eastAsia="es-NI"/>
-        </w:rPr>
-        <w:t>git</w:t>
-      </w:r>
-      <w:proofErr w:type="spellEnd"/>
-      <w:r>
-        <w:rPr>
-          <w:rFonts w:ascii="Arial" w:eastAsia="Times New Roman" w:hAnsi="Arial" w:cs="Arial"/>
-          <w:lang w:val="es-NI" w:eastAsia="es-NI"/>
-        </w:rPr>
-        <w:t xml:space="preserve"> </w:t>
-      </w:r>
-      <w:proofErr w:type="spellStart"/>
-      <w:r>
-        <w:rPr>
-          <w:rFonts w:ascii="Arial" w:eastAsia="Times New Roman" w:hAnsi="Arial" w:cs="Arial"/>
-          <w:lang w:val="es-NI" w:eastAsia="es-NI"/>
-        </w:rPr>
-        <w:t>push</w:t>
-      </w:r>
-      <w:proofErr w:type="spellEnd"/>
-      <w:r>
-        <w:rPr>
-          <w:rFonts w:ascii="Arial" w:eastAsia="Times New Roman" w:hAnsi="Arial" w:cs="Arial"/>
-          <w:lang w:val="es-NI" w:eastAsia="es-NI"/>
-        </w:rPr>
-        <w:t xml:space="preserve"> </w:t>
-      </w:r>
-      <w:proofErr w:type="spellStart"/>
-      <w:r>
-        <w:rPr>
-          <w:rFonts w:ascii="Arial" w:eastAsia="Times New Roman" w:hAnsi="Arial" w:cs="Arial"/>
-          <w:lang w:val="es-NI" w:eastAsia="es-NI"/>
-        </w:rPr>
-        <w:t>origin</w:t>
-      </w:r>
-      <w:proofErr w:type="spellEnd"/>
-      <w:r>
-        <w:rPr>
-          <w:rFonts w:ascii="Arial" w:eastAsia="Times New Roman" w:hAnsi="Arial" w:cs="Arial"/>
-          <w:lang w:val="es-NI" w:eastAsia="es-NI"/>
-        </w:rPr>
-        <w:t xml:space="preserve"> nueva-rama </w:t>
-      </w:r>
-    </w:p>
-    <w:p>
-      <w:pPr>
-        <w:spacing w:before="100" w:beforeAutospacing="1" w:after="100" w:afterAutospacing="1" w:line="240" w:lineRule="auto"/>
-        <w:rPr>
-          <w:rFonts w:ascii="Arial" w:eastAsia="Times New Roman" w:hAnsi="Arial" w:cs="Arial"/>
-          <w:lang w:val="es-NI" w:eastAsia="es-NI"/>
-        </w:rPr>
-      </w:pPr>
-      <w:r>
-        <w:rPr>
-          <w:rFonts w:ascii="Arial" w:eastAsia="Times New Roman" w:hAnsi="Arial" w:cs="Arial"/>
-          <w:lang w:val="es-NI" w:eastAsia="es-NI"/>
-        </w:rPr>
-        <w:t xml:space="preserve">Posteriormente, se realizó la integración de cambios mediante el uso de </w:t>
-      </w:r>
-      <w:proofErr w:type="spellStart"/>
-      <w:r>
-        <w:rPr>
-          <w:rFonts w:ascii="Arial" w:eastAsia="Times New Roman" w:hAnsi="Arial" w:cs="Arial"/>
-          <w:lang w:val="es-NI" w:eastAsia="es-NI"/>
-        </w:rPr>
-        <w:t>git</w:t>
-      </w:r>
-      <w:proofErr w:type="spellEnd"/>
-      <w:r>
-        <w:rPr>
-          <w:rFonts w:ascii="Arial" w:eastAsia="Times New Roman" w:hAnsi="Arial" w:cs="Arial"/>
-          <w:lang w:val="es-NI" w:eastAsia="es-NI"/>
-        </w:rPr>
-        <w:t xml:space="preserve"> </w:t>
-      </w:r>
-      <w:proofErr w:type="spellStart"/>
-      <w:r>
-        <w:rPr>
-          <w:rFonts w:ascii="Arial" w:eastAsia="Times New Roman" w:hAnsi="Arial" w:cs="Arial"/>
-          <w:lang w:val="es-NI" w:eastAsia="es-NI"/>
-        </w:rPr>
-        <w:t>merge</w:t>
-      </w:r>
-      <w:proofErr w:type="spellEnd"/>
-      <w:r>
-        <w:rPr>
-          <w:rFonts w:ascii="Arial" w:eastAsia="Times New Roman" w:hAnsi="Arial" w:cs="Arial"/>
-          <w:lang w:val="es-NI" w:eastAsia="es-NI"/>
-        </w:rPr>
-        <w:t xml:space="preserve">, permitiendo unir ramas como </w:t>
-      </w:r>
-      <w:proofErr w:type="spellStart"/>
-      <w:r>
-        <w:rPr>
-          <w:rFonts w:ascii="Arial" w:eastAsia="Times New Roman" w:hAnsi="Arial" w:cs="Arial"/>
-          <w:b/>
-          <w:bCs/>
-          <w:lang w:val="es-NI" w:eastAsia="es-NI"/>
-        </w:rPr>
-        <w:t>menu-ui</w:t>
-      </w:r>
-      <w:proofErr w:type="spellEnd"/>
-      <w:r>
-        <w:rPr>
-          <w:rFonts w:ascii="Arial" w:eastAsia="Times New Roman" w:hAnsi="Arial" w:cs="Arial"/>
-          <w:lang w:val="es-NI" w:eastAsia="es-NI"/>
-        </w:rPr>
-        <w:t xml:space="preserve"> a la rama principal.</w:t>
-      </w:r>
-    </w:p>
-    <w:p>
-      <w:pPr>
-        <w:rPr>
-          <w:lang w:val="es-NI"/>
-        </w:rPr>
-      </w:pPr>
+          <w:lang w:val="es-NI" w:eastAsia="es-NI"/>
+        </w:rPr>
+        <w:t xml:space="preserve"> usados en la elaboración del entorno del video juego, igual de carpetas de documentos y scripts que se usarán de acuerdo al avance del video juego.</w:t>
+      </w:r>
+      <w:bookmarkStart w:id="0" w:name="_GoBack"/>
+      <w:bookmarkEnd w:id="0"/>
     </w:p>
     <w:sectPr>
       <w:pgSz w:w="12240" w:h="15840"/>
@@ -1103,6 +1026,119 @@
     </w:lvl>
   </w:abstractNum>
   <w:abstractNum w:abstractNumId="2" w15:restartNumberingAfterBreak="0">
+    <w:nsid w:val="486D4CBB"/>
+    <w:multiLevelType w:val="hybridMultilevel"/>
+    <w:tmpl w:val="CCB83F86"/>
+    <w:lvl w:ilvl="0" w:tplc="4C0A0001">
+      <w:start w:val="1"/>
+      <w:numFmt w:val="bullet"/>
+      <w:lvlText w:val=""/>
+      <w:lvlJc w:val="left"/>
+      <w:pPr>
+        <w:ind w:left="720" w:hanging="360"/>
+      </w:pPr>
+      <w:rPr>
+        <w:rFonts w:ascii="Symbol" w:hAnsi="Symbol" w:hint="default"/>
+      </w:rPr>
+    </w:lvl>
+    <w:lvl w:ilvl="1" w:tplc="4C0A0003" w:tentative="1">
+      <w:start w:val="1"/>
+      <w:numFmt w:val="bullet"/>
+      <w:lvlText w:val="o"/>
+      <w:lvlJc w:val="left"/>
+      <w:pPr>
+        <w:ind w:left="1440" w:hanging="360"/>
+      </w:pPr>
+      <w:rPr>
+        <w:rFonts w:ascii="Courier New" w:hAnsi="Courier New" w:cs="Courier New" w:hint="default"/>
+      </w:rPr>
+    </w:lvl>
+    <w:lvl w:ilvl="2" w:tplc="4C0A0005" w:tentative="1">
+      <w:start w:val="1"/>
+      <w:numFmt w:val="bullet"/>
+      <w:lvlText w:val=""/>
+      <w:lvlJc w:val="left"/>
+      <w:pPr>
+        <w:ind w:left="2160" w:hanging="360"/>
+      </w:pPr>
+      <w:rPr>
+        <w:rFonts w:ascii="Wingdings" w:hAnsi="Wingdings" w:hint="default"/>
+      </w:rPr>
+    </w:lvl>
+    <w:lvl w:ilvl="3" w:tplc="4C0A0001" w:tentative="1">
+      <w:start w:val="1"/>
+      <w:numFmt w:val="bullet"/>
+      <w:lvlText w:val=""/>
+      <w:lvlJc w:val="left"/>
+      <w:pPr>
+        <w:ind w:left="2880" w:hanging="360"/>
+      </w:pPr>
+      <w:rPr>
+        <w:rFonts w:ascii="Symbol" w:hAnsi="Symbol" w:hint="default"/>
+      </w:rPr>
+    </w:lvl>
+    <w:lvl w:ilvl="4" w:tplc="4C0A0003" w:tentative="1">
+      <w:start w:val="1"/>
+      <w:numFmt w:val="bullet"/>
+      <w:lvlText w:val="o"/>
+      <w:lvlJc w:val="left"/>
+      <w:pPr>
+        <w:ind w:left="3600" w:hanging="360"/>
+      </w:pPr>
+      <w:rPr>
+        <w:rFonts w:ascii="Courier New" w:hAnsi="Courier New" w:cs="Courier New" w:hint="default"/>
+      </w:rPr>
+    </w:lvl>
+    <w:lvl w:ilvl="5" w:tplc="4C0A0005" w:tentative="1">
+      <w:start w:val="1"/>
+      <w:numFmt w:val="bullet"/>
+      <w:lvlText w:val=""/>
+      <w:lvlJc w:val="left"/>
+      <w:pPr>
+        <w:ind w:left="4320" w:hanging="360"/>
+      </w:pPr>
+      <w:rPr>
+        <w:rFonts w:ascii="Wingdings" w:hAnsi="Wingdings" w:hint="default"/>
+      </w:rPr>
+    </w:lvl>
+    <w:lvl w:ilvl="6" w:tplc="4C0A0001" w:tentative="1">
+      <w:start w:val="1"/>
+      <w:numFmt w:val="bullet"/>
+      <w:lvlText w:val=""/>
+      <w:lvlJc w:val="left"/>
+      <w:pPr>
+        <w:ind w:left="5040" w:hanging="360"/>
+      </w:pPr>
+      <w:rPr>
+        <w:rFonts w:ascii="Symbol" w:hAnsi="Symbol" w:hint="default"/>
+      </w:rPr>
+    </w:lvl>
+    <w:lvl w:ilvl="7" w:tplc="4C0A0003" w:tentative="1">
+      <w:start w:val="1"/>
+      <w:numFmt w:val="bullet"/>
+      <w:lvlText w:val="o"/>
+      <w:lvlJc w:val="left"/>
+      <w:pPr>
+        <w:ind w:left="5760" w:hanging="360"/>
+      </w:pPr>
+      <w:rPr>
+        <w:rFonts w:ascii="Courier New" w:hAnsi="Courier New" w:cs="Courier New" w:hint="default"/>
+      </w:rPr>
+    </w:lvl>
+    <w:lvl w:ilvl="8" w:tplc="4C0A0005" w:tentative="1">
+      <w:start w:val="1"/>
+      <w:numFmt w:val="bullet"/>
+      <w:lvlText w:val=""/>
+      <w:lvlJc w:val="left"/>
+      <w:pPr>
+        <w:ind w:left="6480" w:hanging="360"/>
+      </w:pPr>
+      <w:rPr>
+        <w:rFonts w:ascii="Wingdings" w:hAnsi="Wingdings" w:hint="default"/>
+      </w:rPr>
+    </w:lvl>
+  </w:abstractNum>
+  <w:abstractNum w:abstractNumId="3" w15:restartNumberingAfterBreak="0">
     <w:nsid w:val="61E850EB"/>
     <w:multiLevelType w:val="hybridMultilevel"/>
     <w:tmpl w:val="181A217C"/>
@@ -1216,13 +1252,16 @@
     </w:lvl>
   </w:abstractNum>
   <w:num w:numId="1">
-    <w:abstractNumId w:val="2"/>
+    <w:abstractNumId w:val="3"/>
   </w:num>
   <w:num w:numId="2">
     <w:abstractNumId w:val="0"/>
   </w:num>
   <w:num w:numId="3">
     <w:abstractNumId w:val="1"/>
+  </w:num>
+  <w:num w:numId="4">
+    <w:abstractNumId w:val="2"/>
   </w:num>
 </w:numbering>
 </file>

</xml_diff>

<commit_message>
Se agrego al word link repositorio
</commit_message>
<xml_diff>
--- a/docs/git hub.docx
+++ b/docs/git hub.docx
@@ -561,23 +561,24 @@
           <w:rFonts w:ascii="Arial" w:eastAsia="Times New Roman" w:hAnsi="Arial" w:cs="Arial"/>
           <w:lang w:val="es-NI" w:eastAsia="es-NI"/>
         </w:rPr>
-        <w:t xml:space="preserve"> (aquí </w:t>
-      </w:r>
-      <w:proofErr w:type="spellStart"/>
-      <w:r>
-        <w:rPr>
-          <w:rFonts w:ascii="Arial" w:eastAsia="Times New Roman" w:hAnsi="Arial" w:cs="Arial"/>
-          <w:lang w:val="es-NI" w:eastAsia="es-NI"/>
-        </w:rPr>
-        <w:t>pegás</w:t>
-      </w:r>
-      <w:proofErr w:type="spellEnd"/>
-      <w:r>
-        <w:rPr>
-          <w:rFonts w:ascii="Arial" w:eastAsia="Times New Roman" w:hAnsi="Arial" w:cs="Arial"/>
-          <w:lang w:val="es-NI" w:eastAsia="es-NI"/>
-        </w:rPr>
-        <w:t xml:space="preserve"> el link)</w:t>
+        <w:t xml:space="preserve"> </w:t>
+      </w:r>
+      <w:hyperlink r:id="rId9" w:history="1">
+        <w:r>
+          <w:rPr>
+            <w:rStyle w:val="Hipervnculo"/>
+            <w:rFonts w:ascii="Arial" w:eastAsia="Times New Roman" w:hAnsi="Arial" w:cs="Arial"/>
+            <w:lang w:val="es-NI" w:eastAsia="es-NI"/>
+          </w:rPr>
+          <w:t>https://github.com/josenica/decimalandia-integrador1.git</w:t>
+        </w:r>
+      </w:hyperlink>
+      <w:r>
+        <w:rPr>
+          <w:rFonts w:ascii="Arial" w:eastAsia="Times New Roman" w:hAnsi="Arial" w:cs="Arial"/>
+          <w:lang w:val="es-NI" w:eastAsia="es-NI"/>
+        </w:rPr>
+        <w:t xml:space="preserve"> </w:t>
       </w:r>
     </w:p>
     <w:p>
@@ -712,8 +713,233 @@
         </w:rPr>
         <w:t xml:space="preserve"> usados en la elaboración del entorno del video juego, igual de carpetas de documentos y scripts que se usarán de acuerdo al avance del video juego.</w:t>
       </w:r>
-      <w:bookmarkStart w:id="0" w:name="_GoBack"/>
-      <w:bookmarkEnd w:id="0"/>
+    </w:p>
+    <w:p>
+      <w:pPr>
+        <w:rPr>
+          <w:rFonts w:ascii="Arial" w:eastAsia="Times New Roman" w:hAnsi="Arial" w:cs="Arial"/>
+          <w:lang w:val="es-NI" w:eastAsia="es-NI"/>
+        </w:rPr>
+      </w:pPr>
+      <w:r>
+        <w:rPr>
+          <w:rFonts w:ascii="Arial" w:eastAsia="Times New Roman" w:hAnsi="Arial" w:cs="Arial"/>
+          <w:lang w:val="es-NI" w:eastAsia="es-NI"/>
+        </w:rPr>
+        <w:br w:type="page"/>
+      </w:r>
+    </w:p>
+    <w:bookmarkStart w:id="0" w:name="_MON_1838613890"/>
+    <w:bookmarkEnd w:id="0"/>
+    <w:p>
+      <w:pPr>
+        <w:spacing w:before="100" w:beforeAutospacing="1" w:after="100" w:afterAutospacing="1" w:line="240" w:lineRule="auto"/>
+        <w:rPr>
+          <w:rFonts w:ascii="Arial" w:eastAsia="Times New Roman" w:hAnsi="Arial" w:cs="Arial"/>
+          <w:lang w:val="es-NI" w:eastAsia="es-NI"/>
+        </w:rPr>
+      </w:pPr>
+      <w:r>
+        <w:rPr>
+          <w:rFonts w:ascii="Arial" w:eastAsia="Times New Roman" w:hAnsi="Arial" w:cs="Arial"/>
+          <w:lang w:val="es-NI" w:eastAsia="es-NI"/>
+        </w:rPr>
+        <w:object w:dxaOrig="1544" w:dyaOrig="999">
+          <v:shapetype id="_x0000_t75" coordsize="21600,21600" o:spt="75" o:preferrelative="t" path="m@4@5l@4@11@9@11@9@5xe" filled="f" stroked="f">
+            <v:stroke joinstyle="miter"/>
+            <v:formulas>
+              <v:f eqn="if lineDrawn pixelLineWidth 0"/>
+              <v:f eqn="sum @0 1 0"/>
+              <v:f eqn="sum 0 0 @1"/>
+              <v:f eqn="prod @2 1 2"/>
+              <v:f eqn="prod @3 21600 pixelWidth"/>
+              <v:f eqn="prod @3 21600 pixelHeight"/>
+              <v:f eqn="sum @0 0 1"/>
+              <v:f eqn="prod @6 1 2"/>
+              <v:f eqn="prod @7 21600 pixelWidth"/>
+              <v:f eqn="sum @8 21600 0"/>
+              <v:f eqn="prod @7 21600 pixelHeight"/>
+              <v:f eqn="sum @10 21600 0"/>
+            </v:formulas>
+            <v:path o:extrusionok="f" gradientshapeok="t" o:connecttype="rect"/>
+            <o:lock v:ext="edit" aspectratio="t"/>
+          </v:shapetype>
+          <v:shape id="_x0000_i1025" type="#_x0000_t75" style="width:77.55pt;height:49.85pt" o:ole="">
+            <v:imagedata r:id="rId10" o:title=""/>
+          </v:shape>
+          <o:OLEObject Type="Embed" ProgID="Word.Document.12" ShapeID="_x0000_i1025" DrawAspect="Icon" ObjectID="_1838614102" r:id="rId11">
+            <o:FieldCodes>\s</o:FieldCodes>
+          </o:OLEObject>
+        </w:object>
+      </w:r>
+    </w:p>
+    <w:p>
+      <w:pPr>
+        <w:spacing w:before="100" w:beforeAutospacing="1" w:after="100" w:afterAutospacing="1" w:line="240" w:lineRule="auto"/>
+        <w:rPr>
+          <w:rFonts w:ascii="Arial" w:eastAsia="Times New Roman" w:hAnsi="Arial" w:cs="Arial"/>
+          <w:lang w:val="es-NI" w:eastAsia="es-NI"/>
+        </w:rPr>
+      </w:pPr>
+      <w:r>
+        <w:rPr>
+          <w:rFonts w:ascii="Arial" w:eastAsia="Times New Roman" w:hAnsi="Arial" w:cs="Arial"/>
+          <w:lang w:val="es-NI" w:eastAsia="es-NI"/>
+        </w:rPr>
+        <w:t xml:space="preserve">En </w:t>
+      </w:r>
+      <w:r>
+        <w:rPr>
+          <w:rFonts w:ascii="Arial" w:eastAsia="Times New Roman" w:hAnsi="Arial" w:cs="Arial"/>
+          <w:lang w:val="es-NI" w:eastAsia="es-NI"/>
+        </w:rPr>
+        <w:t>este archivo</w:t>
+      </w:r>
+      <w:r>
+        <w:rPr>
+          <w:rFonts w:ascii="Arial" w:eastAsia="Times New Roman" w:hAnsi="Arial" w:cs="Arial"/>
+          <w:lang w:val="es-NI" w:eastAsia="es-NI"/>
+        </w:rPr>
+        <w:t xml:space="preserve"> se muestra el trabajo realizado por el compañero, usando las funciones básicas en </w:t>
+      </w:r>
+      <w:proofErr w:type="spellStart"/>
+      <w:r>
+        <w:rPr>
+          <w:rFonts w:ascii="Arial" w:eastAsia="Times New Roman" w:hAnsi="Arial" w:cs="Arial"/>
+          <w:lang w:val="es-NI" w:eastAsia="es-NI"/>
+        </w:rPr>
+        <w:t>git</w:t>
+      </w:r>
+      <w:proofErr w:type="spellEnd"/>
+      <w:r>
+        <w:rPr>
+          <w:rFonts w:ascii="Arial" w:eastAsia="Times New Roman" w:hAnsi="Arial" w:cs="Arial"/>
+          <w:lang w:val="es-NI" w:eastAsia="es-NI"/>
+        </w:rPr>
+        <w:t>.</w:t>
+      </w:r>
+    </w:p>
+    <w:p>
+      <w:pPr>
+        <w:spacing w:before="100" w:beforeAutospacing="1" w:after="100" w:afterAutospacing="1" w:line="240" w:lineRule="auto"/>
+        <w:rPr>
+          <w:rFonts w:ascii="Arial" w:eastAsia="Times New Roman" w:hAnsi="Arial" w:cs="Arial"/>
+          <w:lang w:val="es-NI" w:eastAsia="es-NI"/>
+        </w:rPr>
+      </w:pPr>
+      <w:r>
+        <w:rPr>
+          <w:rFonts w:ascii="Arial" w:eastAsia="Times New Roman" w:hAnsi="Arial" w:cs="Arial"/>
+          <w:noProof/>
+          <w:lang w:val="es-NI" w:eastAsia="es-NI"/>
+        </w:rPr>
+        <w:drawing>
+          <wp:anchor distT="0" distB="0" distL="114300" distR="114300" simplePos="0" relativeHeight="251660288" behindDoc="0" locked="0" layoutInCell="1" allowOverlap="1">
+            <wp:simplePos x="0" y="0"/>
+            <wp:positionH relativeFrom="column">
+              <wp:posOffset>1319</wp:posOffset>
+            </wp:positionH>
+            <wp:positionV relativeFrom="paragraph">
+              <wp:posOffset>-4201</wp:posOffset>
+            </wp:positionV>
+            <wp:extent cx="5612130" cy="2990850"/>
+            <wp:effectExtent l="0" t="0" r="7620" b="0"/>
+            <wp:wrapTopAndBottom/>
+            <wp:docPr id="4" name="Imagen 4"/>
+            <wp:cNvGraphicFramePr>
+              <a:graphicFrameLocks xmlns:a="http://schemas.openxmlformats.org/drawingml/2006/main" noChangeAspect="1"/>
+            </wp:cNvGraphicFramePr>
+            <a:graphic xmlns:a="http://schemas.openxmlformats.org/drawingml/2006/main">
+              <a:graphicData uri="http://schemas.openxmlformats.org/drawingml/2006/picture">
+                <pic:pic xmlns:pic="http://schemas.openxmlformats.org/drawingml/2006/picture">
+                  <pic:nvPicPr>
+                    <pic:cNvPr id="4" name="ddda.png"/>
+                    <pic:cNvPicPr/>
+                  </pic:nvPicPr>
+                  <pic:blipFill>
+                    <a:blip r:embed="rId12" cstate="print">
+                      <a:extLst>
+                        <a:ext uri="{28A0092B-C50C-407E-A947-70E740481C1C}">
+                          <a14:useLocalDpi xmlns:a14="http://schemas.microsoft.com/office/drawing/2010/main" val="0"/>
+                        </a:ext>
+                      </a:extLst>
+                    </a:blip>
+                    <a:stretch>
+                      <a:fillRect/>
+                    </a:stretch>
+                  </pic:blipFill>
+                  <pic:spPr>
+                    <a:xfrm>
+                      <a:off x="0" y="0"/>
+                      <a:ext cx="5612130" cy="2990850"/>
+                    </a:xfrm>
+                    <a:prstGeom prst="rect">
+                      <a:avLst/>
+                    </a:prstGeom>
+                  </pic:spPr>
+                </pic:pic>
+              </a:graphicData>
+            </a:graphic>
+          </wp:anchor>
+        </w:drawing>
+      </w:r>
+    </w:p>
+    <w:p>
+      <w:pPr>
+        <w:rPr>
+          <w:rFonts w:ascii="Arial" w:eastAsia="Times New Roman" w:hAnsi="Arial" w:cs="Arial"/>
+          <w:lang w:val="es-NI" w:eastAsia="es-NI"/>
+        </w:rPr>
+      </w:pPr>
+    </w:p>
+    <w:p>
+      <w:pPr>
+        <w:rPr>
+          <w:rFonts w:ascii="Arial" w:eastAsia="Times New Roman" w:hAnsi="Arial" w:cs="Arial"/>
+          <w:lang w:val="es-NI" w:eastAsia="es-NI"/>
+        </w:rPr>
+      </w:pPr>
+      <w:r>
+        <w:rPr>
+          <w:rFonts w:ascii="Arial" w:eastAsia="Times New Roman" w:hAnsi="Arial" w:cs="Arial"/>
+          <w:lang w:val="es-NI" w:eastAsia="es-NI"/>
+        </w:rPr>
+        <w:t xml:space="preserve">En esta imagen se muestra la clonación y creación de carpetas que se usaron para subir </w:t>
+      </w:r>
+      <w:proofErr w:type="spellStart"/>
+      <w:r>
+        <w:rPr>
+          <w:rFonts w:ascii="Arial" w:eastAsia="Times New Roman" w:hAnsi="Arial" w:cs="Arial"/>
+          <w:lang w:val="es-NI" w:eastAsia="es-NI"/>
+        </w:rPr>
+        <w:t>assets</w:t>
+      </w:r>
+      <w:proofErr w:type="spellEnd"/>
+      <w:r>
+        <w:rPr>
+          <w:rFonts w:ascii="Arial" w:eastAsia="Times New Roman" w:hAnsi="Arial" w:cs="Arial"/>
+          <w:lang w:val="es-NI" w:eastAsia="es-NI"/>
+        </w:rPr>
+        <w:t xml:space="preserve">, </w:t>
+      </w:r>
+      <w:proofErr w:type="spellStart"/>
+      <w:r>
+        <w:rPr>
+          <w:rFonts w:ascii="Arial" w:eastAsia="Times New Roman" w:hAnsi="Arial" w:cs="Arial"/>
+          <w:lang w:val="es-NI" w:eastAsia="es-NI"/>
+        </w:rPr>
+        <w:t>documents</w:t>
+      </w:r>
+      <w:proofErr w:type="spellEnd"/>
+      <w:r>
+        <w:rPr>
+          <w:rFonts w:ascii="Arial" w:eastAsia="Times New Roman" w:hAnsi="Arial" w:cs="Arial"/>
+          <w:lang w:val="es-NI" w:eastAsia="es-NI"/>
+        </w:rPr>
+        <w:t xml:space="preserve"> y scripts.</w:t>
+      </w:r>
+      <w:bookmarkStart w:id="1" w:name="_GoBack"/>
+      <w:bookmarkEnd w:id="1"/>
     </w:p>
     <w:sectPr>
       <w:pgSz w:w="12240" w:h="15840"/>

</xml_diff>